<commit_message>
Polish version 4 dataset provenance wording
</commit_message>
<xml_diff>
--- a/deliverables/exports/article-draft-v4.docx
+++ b/deliverables/exports/article-draft-v4.docx
@@ -201,7 +201,7 @@
         <w:pStyle w:val="FirstParagraph"/>
       </w:pPr>
       <w:r>
-        <w:t xml:space="preserve">The dataset originated from video footage of Philippine traffic scenes. Frames were extracted and annotated through a Roboflow-based workflow, then exported in YOLO26 format for model training and evaluation. The Roboflow export metadata bundled with the dataset indicates that the source dataset was exported on February 28, 2026 with resizing to 640 x 640 and auto-orientation applied during preprocessing. The experiment used the balanced dataset stored under the</w:t>
+        <w:t xml:space="preserve">The dataset originated from video footage of Philippine traffic scenes. Frames were extracted and annotated through a Roboflow-based workflow, then exported in YOLO26 format for model training and evaluation. The Roboflow export metadata shows that the source dataset was exported on February 28, 2026 and that auto-orientation and resizing to 640 x 640 were applied during preprocessing. For the main experiment, we used the balanced version of this dataset stored in the</w:t>
       </w:r>
       <w:r>
         <w:t xml:space="preserve"> </w:t>
@@ -216,7 +216,7 @@
         <w:t xml:space="preserve"> </w:t>
       </w:r>
       <w:r>
-        <w:t xml:space="preserve">directory in the project dataset workspace. The dataset contained seven object classes: Bicycle, Car, Jeepney, Pedestrian, SUV, Tricycle, and Truck. Based on the notebook outputs, the dataset comprised 1,310 images in total, partitioned into 1,010 training images, 154 validation images, and 146 test images. The training set included both original and augmented images. Specifically, 705 training images were original samples and 305 were augmentation-derived samples. The notebook also reported residual class imbalance in the training annotations, with class counts ranging from 539 to 1,581 and an imbalance ratio of 2.93, indicating that the balanced dataset improved but did not eliminate class frequency differences.</w:t>
+        <w:t xml:space="preserve">directory of the project workspace. The dataset contained seven object classes: Bicycle, Car, Jeepney, Pedestrian, SUV, Tricycle, and Truck. Based on the notebook outputs, the dataset comprised 1,310 images in total, partitioned into 1,010 training images, 154 validation images, and 146 test images. The training set included both original and augmented images. Specifically, 705 training images were original samples and 305 were augmentation-derived samples. The notebook also reported residual class imbalance in the training annotations, with class counts ranging from 539 to 1,581 and an imbalance ratio of 2.93, indicating that the balanced dataset improved but did not eliminate class frequency differences.</w:t>
       </w:r>
     </w:p>
     <w:p>

</xml_diff>